<commit_message>
Clean up Lab2: remove duplicate files and README, update document with all screenshots
</commit_message>
<xml_diff>
--- a/Lab2/OS_Lab2_2024UCP1566.docx
+++ b/Lab2/OS_Lab2_2024UCP1566.docx
@@ -37,7 +37,7 @@
             <w:rFonts w:ascii="Calibri" w:hAnsi="Calibri"/>
             <w:sz w:val="22"/>
           </w:rPr>
-          <w:t xml:space="preserve">https://github.com/the-sage-00/OS-LAB/tree/main/Lab2</w:t>
+          <w:t xml:space="preserve">https://github.com/the-sage-00/OS-LAB</w:t>
         </w:r>
       </w:hyperlink>
     </w:p>
@@ -207,7 +207,7 @@
           <w:color w:val="111111"/>
           <w:sz w:val="22"/>
         </w:rPr>
-        <w:t>Script to periodically collect performance monitoring data:</w:t>
+        <w:t>Script to periodically collect performance monitoring data (q2_proc_monitor.sh):</w:t>
       </w:r>
     </w:p>
     <w:tbl>

</xml_diff>